<commit_message>
Use consistent terms in the final IA and justify the Model 1 result
- One name per idea: trapezium rule, Gini coefficient G, and "I"
  throughout instead of switching to "we".
- Section 6.5 now shows why Model 1 has the same Gini estimate as the
  ordinary quadratic (the cubic part is odd about x = 0.5 and separates in
  the least-squares sums), instead of only checking it with the numbers.

Co-Authored-By: Claude Opus 5.5 <noreply@anthropic.com>
Claude-Session: https://claude.ai/code/session_015SCYj96TGcZgc8vCSX2dH8
</commit_message>
<xml_diff>
--- a/math-ia-gini/Corrections_to_your_text.docx
+++ b/math-ia-gini/Corrections_to_your_text.docx
@@ -134,7 +134,48 @@
         <w:t xml:space="preserve"> </w:t>
       </w:r>
       <w:r>
-        <w:t xml:space="preserve">studying international comparisons of wealth and quality of life. Every single comparison made would use terms like “Gini coefficient of 0.3” and “Gini coefficient of 0.6”, whereby the larger numerical figure indicated greater inequality. However, no explanation for how such figures were determined</w:t>
+        <w:t xml:space="preserve">studying international comparisons of wealth and quality of life.</w:t>
+      </w:r>
+      <w:r>
+        <w:t xml:space="preserve"> </w:t>
+      </w:r>
+      <w:r>
+        <w:rPr>
+          <w:strike/>
+        </w:rPr>
+        <w:t xml:space="preserve">Every single</w:t>
+      </w:r>
+      <w:r>
+        <w:t xml:space="preserve"> </w:t>
+      </w:r>
+      <w:r>
+        <w:rPr>
+          <w:b/>
+          <w:bCs/>
+          <w:u w:val="single"/>
+        </w:rPr>
+        <w:t xml:space="preserve">Almost every</w:t>
+      </w:r>
+      <w:r>
+        <w:t xml:space="preserve"> </w:t>
+      </w:r>
+      <w:r>
+        <w:t xml:space="preserve">comparison</w:t>
+      </w:r>
+      <w:r>
+        <w:t xml:space="preserve"> </w:t>
+      </w:r>
+      <w:r>
+        <w:rPr>
+          <w:strike/>
+        </w:rPr>
+        <w:t xml:space="preserve">made</w:t>
+      </w:r>
+      <w:r>
+        <w:t xml:space="preserve"> </w:t>
+      </w:r>
+      <w:r>
+        <w:t xml:space="preserve">would use terms like “Gini coefficient of 0.3” and “Gini coefficient of 0.6”, whereby the larger numerical figure indicated greater inequality. However, no explanation for how such figures were determined</w:t>
       </w:r>
       <w:r>
         <w:t xml:space="preserve"> </w:t>
@@ -670,7 +711,33 @@
         <w:t xml:space="preserve"> </w:t>
       </w:r>
       <w:r>
-        <w:t xml:space="preserve">the inequality spectrum. Specifically speaking, according to</w:t>
+        <w:t xml:space="preserve">the inequality spectrum.</w:t>
+      </w:r>
+      <w:r>
+        <w:t xml:space="preserve"> </w:t>
+      </w:r>
+      <w:r>
+        <w:rPr>
+          <w:strike/>
+        </w:rPr>
+        <w:t xml:space="preserve">Specifically speaking,</w:t>
+      </w:r>
+      <w:r>
+        <w:t xml:space="preserve"> </w:t>
+      </w:r>
+      <w:r>
+        <w:rPr>
+          <w:b/>
+          <w:bCs/>
+          <w:u w:val="single"/>
+        </w:rPr>
+        <w:t xml:space="preserve">Specifically,</w:t>
+      </w:r>
+      <w:r>
+        <w:t xml:space="preserve"> </w:t>
+      </w:r>
+      <w:r>
+        <w:t xml:space="preserve">according to</w:t>
       </w:r>
       <w:r>
         <w:t xml:space="preserve"> </w:t>
@@ -1330,7 +1397,33 @@
         <w:t xml:space="preserve"> </w:t>
       </w:r>
       <w:r>
-        <w:t xml:space="preserve">one must acknowledge that it will never be completely determined. What we define as accurate does not mean absolutely exact compared with objective reality. Instead, accuracy is defined</w:t>
+        <w:t xml:space="preserve">one must acknowledge that it will never be completely determined. What</w:t>
+      </w:r>
+      <w:r>
+        <w:t xml:space="preserve"> </w:t>
+      </w:r>
+      <w:r>
+        <w:rPr>
+          <w:strike/>
+        </w:rPr>
+        <w:t xml:space="preserve">we</w:t>
+      </w:r>
+      <w:r>
+        <w:t xml:space="preserve"> </w:t>
+      </w:r>
+      <w:r>
+        <w:rPr>
+          <w:b/>
+          <w:bCs/>
+          <w:u w:val="single"/>
+        </w:rPr>
+        <w:t xml:space="preserve">I</w:t>
+      </w:r>
+      <w:r>
+        <w:t xml:space="preserve"> </w:t>
+      </w:r>
+      <w:r>
+        <w:t xml:space="preserve">define as accurate does not mean absolutely exact compared with objective reality. Instead, accuracy is defined</w:t>
       </w:r>
       <w:r>
         <w:t xml:space="preserve"> </w:t>
@@ -1356,7 +1449,33 @@
         <w:t xml:space="preserve"> </w:t>
       </w:r>
       <w:r>
-        <w:t xml:space="preserve">to our selected</w:t>
+        <w:t xml:space="preserve">to</w:t>
+      </w:r>
+      <w:r>
+        <w:t xml:space="preserve"> </w:t>
+      </w:r>
+      <w:r>
+        <w:rPr>
+          <w:strike/>
+        </w:rPr>
+        <w:t xml:space="preserve">our</w:t>
+      </w:r>
+      <w:r>
+        <w:t xml:space="preserve"> </w:t>
+      </w:r>
+      <w:r>
+        <w:rPr>
+          <w:b/>
+          <w:bCs/>
+          <w:u w:val="single"/>
+        </w:rPr>
+        <w:t xml:space="preserve">my</w:t>
+      </w:r>
+      <w:r>
+        <w:t xml:space="preserve"> </w:t>
+      </w:r>
+      <w:r>
+        <w:t xml:space="preserve">selected</w:t>
       </w:r>
       <w:r>
         <w:t xml:space="preserve"> </w:t>
@@ -1464,7 +1583,33 @@
         <w:t xml:space="preserve"> </w:t>
       </w:r>
       <w:r>
-        <w:t xml:space="preserve">In each of our estimation</w:t>
+        <w:t xml:space="preserve">In each of</w:t>
+      </w:r>
+      <w:r>
+        <w:t xml:space="preserve"> </w:t>
+      </w:r>
+      <w:r>
+        <w:rPr>
+          <w:strike/>
+        </w:rPr>
+        <w:t xml:space="preserve">our</w:t>
+      </w:r>
+      <w:r>
+        <w:t xml:space="preserve"> </w:t>
+      </w:r>
+      <w:r>
+        <w:rPr>
+          <w:b/>
+          <w:bCs/>
+          <w:u w:val="single"/>
+        </w:rPr>
+        <w:t xml:space="preserve">my</w:t>
+      </w:r>
+      <w:r>
+        <w:t xml:space="preserve"> </w:t>
+      </w:r>
+      <w:r>
+        <w:t xml:space="preserve">estimation</w:t>
       </w:r>
       <w:r>
         <w:t xml:space="preserve"> </w:t>
@@ -1933,7 +2078,126 @@
         <w:pStyle w:val="FirstParagraph"/>
       </w:pPr>
       <w:r>
-        <w:t xml:space="preserve">For this investigation, I downloaded the primary dataset from the World Bank Poverty and Inequality Platform (PIP) for South Africa and Norway. These two countries’ records were compiled together in a single CSV file for ease of comparative calculations (World Bank, 2026). In selecting our data sample, the constraint was that all selected entries had to include a valid national household survey record. Therefore, we will compare the 2022 survey figures alone in this comparison investigation. Before performing our calculations, however, it is important that we critically examine whether the data presented within Table 1 is trustworthy and</w:t>
+        <w:t xml:space="preserve">For this investigation, I downloaded the primary dataset from the World Bank Poverty and Inequality Platform (PIP) for South Africa and Norway. These two countries’ records were compiled together in a single CSV file for ease of comparative calculations (World Bank, 2026). In selecting</w:t>
+      </w:r>
+      <w:r>
+        <w:t xml:space="preserve"> </w:t>
+      </w:r>
+      <w:r>
+        <w:rPr>
+          <w:strike/>
+        </w:rPr>
+        <w:t xml:space="preserve">our</w:t>
+      </w:r>
+      <w:r>
+        <w:t xml:space="preserve"> </w:t>
+      </w:r>
+      <w:r>
+        <w:rPr>
+          <w:b/>
+          <w:bCs/>
+          <w:u w:val="single"/>
+        </w:rPr>
+        <w:t xml:space="preserve">my</w:t>
+      </w:r>
+      <w:r>
+        <w:t xml:space="preserve"> </w:t>
+      </w:r>
+      <w:r>
+        <w:t xml:space="preserve">data sample, the constraint was that all selected entries had to include a valid national household survey record. Therefore,</w:t>
+      </w:r>
+      <w:r>
+        <w:t xml:space="preserve"> </w:t>
+      </w:r>
+      <w:r>
+        <w:rPr>
+          <w:strike/>
+        </w:rPr>
+        <w:t xml:space="preserve">we</w:t>
+      </w:r>
+      <w:r>
+        <w:t xml:space="preserve"> </w:t>
+      </w:r>
+      <w:r>
+        <w:rPr>
+          <w:b/>
+          <w:bCs/>
+          <w:u w:val="single"/>
+        </w:rPr>
+        <w:t xml:space="preserve">I</w:t>
+      </w:r>
+      <w:r>
+        <w:t xml:space="preserve"> </w:t>
+      </w:r>
+      <w:r>
+        <w:t xml:space="preserve">will compare the 2022 survey figures alone in this</w:t>
+      </w:r>
+      <w:r>
+        <w:t xml:space="preserve"> </w:t>
+      </w:r>
+      <w:r>
+        <w:rPr>
+          <w:strike/>
+        </w:rPr>
+        <w:t xml:space="preserve">comparison</w:t>
+      </w:r>
+      <w:r>
+        <w:t xml:space="preserve"> </w:t>
+      </w:r>
+      <w:r>
+        <w:t xml:space="preserve">investigation. Before performing</w:t>
+      </w:r>
+      <w:r>
+        <w:t xml:space="preserve"> </w:t>
+      </w:r>
+      <w:r>
+        <w:rPr>
+          <w:strike/>
+        </w:rPr>
+        <w:t xml:space="preserve">our</w:t>
+      </w:r>
+      <w:r>
+        <w:t xml:space="preserve"> </w:t>
+      </w:r>
+      <w:r>
+        <w:rPr>
+          <w:b/>
+          <w:bCs/>
+          <w:u w:val="single"/>
+        </w:rPr>
+        <w:t xml:space="preserve">my</w:t>
+      </w:r>
+      <w:r>
+        <w:t xml:space="preserve"> </w:t>
+      </w:r>
+      <w:r>
+        <w:t xml:space="preserve">calculations, however, it is important that</w:t>
+      </w:r>
+      <w:r>
+        <w:t xml:space="preserve"> </w:t>
+      </w:r>
+      <w:r>
+        <w:rPr>
+          <w:strike/>
+        </w:rPr>
+        <w:t xml:space="preserve">we</w:t>
+      </w:r>
+      <w:r>
+        <w:t xml:space="preserve"> </w:t>
+      </w:r>
+      <w:r>
+        <w:rPr>
+          <w:b/>
+          <w:bCs/>
+          <w:u w:val="single"/>
+        </w:rPr>
+        <w:t xml:space="preserve">I</w:t>
+      </w:r>
+      <w:r>
+        <w:t xml:space="preserve"> </w:t>
+      </w:r>
+      <w:r>
+        <w:t xml:space="preserve">critically examine whether the data presented within Table 1 is trustworthy and</w:t>
       </w:r>
       <w:r>
         <w:t xml:space="preserve"> </w:t>
@@ -2448,24 +2712,85 @@
         <w:t xml:space="preserve"> </w:t>
       </w:r>
       <w:r>
-        <w:t xml:space="preserve">smaller G-value; the trapezium approach will systematically underestimate</w:t>
-      </w:r>
-      <w:r>
-        <w:t xml:space="preserve"> </w:t>
-      </w:r>
-      <w:r>
-        <w:rPr>
-          <w:b/>
-          <w:bCs/>
-          <w:u w:val="single"/>
-        </w:rPr>
-        <w:t xml:space="preserve">the</w:t>
-      </w:r>
-      <w:r>
-        <w:t xml:space="preserve"> </w:t>
-      </w:r>
-      <w:r>
-        <w:t xml:space="preserve">G-value in each situation.</w:t>
+        <w:t xml:space="preserve">smaller</w:t>
+      </w:r>
+      <w:r>
+        <w:t xml:space="preserve"> </w:t>
+      </w:r>
+      <w:r>
+        <w:rPr>
+          <w:strike/>
+        </w:rPr>
+        <w:t xml:space="preserve">G-value;</w:t>
+      </w:r>
+      <w:r>
+        <w:t xml:space="preserve"> </w:t>
+      </w:r>
+      <w:r>
+        <w:rPr>
+          <w:b/>
+          <w:bCs/>
+          <w:u w:val="single"/>
+        </w:rPr>
+        <w:t xml:space="preserve">G;</w:t>
+      </w:r>
+      <w:r>
+        <w:t xml:space="preserve"> </w:t>
+      </w:r>
+      <w:r>
+        <w:t xml:space="preserve">the trapezium</w:t>
+      </w:r>
+      <w:r>
+        <w:t xml:space="preserve"> </w:t>
+      </w:r>
+      <w:r>
+        <w:rPr>
+          <w:strike/>
+        </w:rPr>
+        <w:t xml:space="preserve">approach</w:t>
+      </w:r>
+      <w:r>
+        <w:t xml:space="preserve"> </w:t>
+      </w:r>
+      <w:r>
+        <w:rPr>
+          <w:b/>
+          <w:bCs/>
+          <w:u w:val="single"/>
+        </w:rPr>
+        <w:t xml:space="preserve">rule</w:t>
+      </w:r>
+      <w:r>
+        <w:t xml:space="preserve"> </w:t>
+      </w:r>
+      <w:r>
+        <w:t xml:space="preserve">will systematically underestimate</w:t>
+      </w:r>
+      <w:r>
+        <w:t xml:space="preserve"> </w:t>
+      </w:r>
+      <w:r>
+        <w:rPr>
+          <w:strike/>
+        </w:rPr>
+        <w:t xml:space="preserve">G-value</w:t>
+      </w:r>
+      <w:r>
+        <w:t xml:space="preserve"> </w:t>
+      </w:r>
+      <w:r>
+        <w:rPr>
+          <w:b/>
+          <w:bCs/>
+          <w:u w:val="single"/>
+        </w:rPr>
+        <w:t xml:space="preserve">G</w:t>
+      </w:r>
+      <w:r>
+        <w:t xml:space="preserve"> </w:t>
+      </w:r>
+      <w:r>
+        <w:t xml:space="preserve">in each situation.</w:t>
       </w:r>
       <w:r>
         <w:t xml:space="preserve"> </w:t>
@@ -2525,7 +2850,7 @@
         <w:pStyle w:val="BodyText"/>
       </w:pPr>
       <w:r>
-        <w:t xml:space="preserve">However, this bias offers further insights into the discrepancy with published G-values. Assuming perfect welfare homogeneity within each decile band – such that each segment of</w:t>
+        <w:t xml:space="preserve">However, this bias offers further insights into the discrepancy with</w:t>
       </w:r>
       <w:r>
         <w:t xml:space="preserve"> </w:t>
@@ -2542,6 +2867,49 @@
         <w:t xml:space="preserve"> </w:t>
       </w:r>
       <w:r>
+        <w:t xml:space="preserve">published</w:t>
+      </w:r>
+      <w:r>
+        <w:t xml:space="preserve"> </w:t>
+      </w:r>
+      <w:r>
+        <w:rPr>
+          <w:strike/>
+        </w:rPr>
+        <w:t xml:space="preserve">G-values.</w:t>
+      </w:r>
+      <w:r>
+        <w:t xml:space="preserve"> </w:t>
+      </w:r>
+      <w:r>
+        <w:rPr>
+          <w:b/>
+          <w:bCs/>
+          <w:u w:val="single"/>
+        </w:rPr>
+        <w:t xml:space="preserve">Gini coefficients.</w:t>
+      </w:r>
+      <w:r>
+        <w:t xml:space="preserve"> </w:t>
+      </w:r>
+      <w:r>
+        <w:t xml:space="preserve">Assuming perfect welfare homogeneity within each decile band – such that each segment of</w:t>
+      </w:r>
+      <w:r>
+        <w:t xml:space="preserve"> </w:t>
+      </w:r>
+      <w:r>
+        <w:rPr>
+          <w:b/>
+          <w:bCs/>
+          <w:u w:val="single"/>
+        </w:rPr>
+        <w:t xml:space="preserve">the</w:t>
+      </w:r>
+      <w:r>
+        <w:t xml:space="preserve"> </w:t>
+      </w:r>
+      <w:r>
         <w:t xml:space="preserve">Lorenz graph takes on straight lines connecting successive</w:t>
       </w:r>
       <w:r>
@@ -2579,7 +2947,7 @@
           <w:bCs/>
           <w:u w:val="single"/>
         </w:rPr>
-        <w:t xml:space="preserve">the G-value of</w:t>
+        <w:t xml:space="preserve">the Gini coefficient of</w:t>
       </w:r>
       <w:r>
         <w:t xml:space="preserve"> </w:t>
@@ -2594,44 +2962,33 @@
         <w:rPr>
           <w:strike/>
         </w:rPr>
-        <w:t xml:space="preserve">generates identical equality measures:</w:t>
-      </w:r>
-      <w:r>
-        <w:t xml:space="preserve"> </w:t>
-      </w:r>
-      <w:r>
-        <w:rPr>
-          <w:b/>
-          <w:bCs/>
-          <w:u w:val="single"/>
-        </w:rPr>
-        <w:t xml:space="preserve">equals exactly the</w:t>
-      </w:r>
-      <w:r>
-        <w:t xml:space="preserve"> </w:t>
-      </w:r>
-      <w:r>
-        <w:t xml:space="preserve">G-value computed by trapezium</w:t>
-      </w:r>
-      <w:r>
-        <w:t xml:space="preserve"> </w:t>
-      </w:r>
-      <w:r>
-        <w:rPr>
-          <w:strike/>
-        </w:rPr>
-        <w:t xml:space="preserve">approximation equals exactly to published figure.</w:t>
-      </w:r>
-      <w:r>
-        <w:t xml:space="preserve"> </w:t>
-      </w:r>
-      <w:r>
-        <w:rPr>
-          <w:b/>
-          <w:bCs/>
-          <w:u w:val="single"/>
-        </w:rPr>
-        <w:t xml:space="preserve">approximation.</w:t>
+        <w:t xml:space="preserve">generates identical equality measures: G-value computed by trapezium approximation</w:t>
+      </w:r>
+      <w:r>
+        <w:t xml:space="preserve"> </w:t>
+      </w:r>
+      <w:r>
+        <w:t xml:space="preserve">equals exactly</w:t>
+      </w:r>
+      <w:r>
+        <w:t xml:space="preserve"> </w:t>
+      </w:r>
+      <w:r>
+        <w:rPr>
+          <w:strike/>
+        </w:rPr>
+        <w:t xml:space="preserve">to published figure.</w:t>
+      </w:r>
+      <w:r>
+        <w:t xml:space="preserve"> </w:t>
+      </w:r>
+      <w:r>
+        <w:rPr>
+          <w:b/>
+          <w:bCs/>
+          <w:u w:val="single"/>
+        </w:rPr>
+        <w:t xml:space="preserve">the trapezium estimate G_T.</w:t>
       </w:r>
       <w:r>
         <w:t xml:space="preserve"> </w:t>
@@ -2646,33 +3003,18 @@
         <w:rPr>
           <w:strike/>
         </w:rPr>
-        <w:t xml:space="preserve">in</w:t>
-      </w:r>
-      <w:r>
-        <w:t xml:space="preserve"> </w:t>
-      </w:r>
-      <w:r>
-        <w:rPr>
-          <w:b/>
-          <w:bCs/>
-          <w:u w:val="single"/>
-        </w:rPr>
-        <w:t xml:space="preserve">between the trapezium estimate and the published</w:t>
-      </w:r>
-      <w:r>
-        <w:t xml:space="preserve"> </w:t>
-      </w:r>
-      <w:r>
-        <w:t xml:space="preserve">G-value</w:t>
-      </w:r>
-      <w:r>
-        <w:t xml:space="preserve"> </w:t>
-      </w:r>
-      <w:r>
-        <w:rPr>
-          <w:strike/>
-        </w:rPr>
-        <w:t xml:space="preserve">obtained using each estimation technique</w:t>
+        <w:t xml:space="preserve">in G-value obtained using each estimation technique</w:t>
+      </w:r>
+      <w:r>
+        <w:t xml:space="preserve"> </w:t>
+      </w:r>
+      <w:r>
+        <w:rPr>
+          <w:b/>
+          <w:bCs/>
+          <w:u w:val="single"/>
+        </w:rPr>
+        <w:t xml:space="preserve">between the trapezium estimate and the published Gini coefficient</w:t>
       </w:r>
       <w:r>
         <w:t xml:space="preserve"> </w:t>
@@ -2857,24 +3199,111 @@
         <w:t xml:space="preserve"> </w:t>
       </w:r>
       <w:r>
-        <w:t xml:space="preserve">These results indicated how a polynomial model should approach the problem. Namely, the cubic equation should fit curves lying below each straight line segment generated from</w:t>
-      </w:r>
-      <w:r>
-        <w:t xml:space="preserve"> </w:t>
-      </w:r>
-      <w:r>
-        <w:rPr>
-          <w:b/>
-          <w:bCs/>
-          <w:u w:val="single"/>
-        </w:rPr>
-        <w:t xml:space="preserve">the</w:t>
-      </w:r>
-      <w:r>
-        <w:t xml:space="preserve"> </w:t>
-      </w:r>
-      <w:r>
-        <w:t xml:space="preserve">trapezium approach, recovering lost inequality.</w:t>
+        <w:t xml:space="preserve">These results indicated how a polynomial model should approach the problem. Namely, the cubic</w:t>
+      </w:r>
+      <w:r>
+        <w:t xml:space="preserve"> </w:t>
+      </w:r>
+      <w:r>
+        <w:rPr>
+          <w:strike/>
+        </w:rPr>
+        <w:t xml:space="preserve">equation</w:t>
+      </w:r>
+      <w:r>
+        <w:t xml:space="preserve"> </w:t>
+      </w:r>
+      <w:r>
+        <w:rPr>
+          <w:b/>
+          <w:bCs/>
+          <w:u w:val="single"/>
+        </w:rPr>
+        <w:t xml:space="preserve">model</w:t>
+      </w:r>
+      <w:r>
+        <w:t xml:space="preserve"> </w:t>
+      </w:r>
+      <w:r>
+        <w:t xml:space="preserve">should</w:t>
+      </w:r>
+      <w:r>
+        <w:t xml:space="preserve"> </w:t>
+      </w:r>
+      <w:r>
+        <w:rPr>
+          <w:strike/>
+        </w:rPr>
+        <w:t xml:space="preserve">fit curves lying</w:t>
+      </w:r>
+      <w:r>
+        <w:t xml:space="preserve"> </w:t>
+      </w:r>
+      <w:r>
+        <w:rPr>
+          <w:b/>
+          <w:bCs/>
+          <w:u w:val="single"/>
+        </w:rPr>
+        <w:t xml:space="preserve">lie</w:t>
+      </w:r>
+      <w:r>
+        <w:t xml:space="preserve"> </w:t>
+      </w:r>
+      <w:r>
+        <w:t xml:space="preserve">below each straight line segment</w:t>
+      </w:r>
+      <w:r>
+        <w:t xml:space="preserve"> </w:t>
+      </w:r>
+      <w:r>
+        <w:rPr>
+          <w:strike/>
+        </w:rPr>
+        <w:t xml:space="preserve">generated from</w:t>
+      </w:r>
+      <w:r>
+        <w:t xml:space="preserve"> </w:t>
+      </w:r>
+      <w:r>
+        <w:rPr>
+          <w:b/>
+          <w:bCs/>
+          <w:u w:val="single"/>
+        </w:rPr>
+        <w:t xml:space="preserve">of the</w:t>
+      </w:r>
+      <w:r>
+        <w:t xml:space="preserve"> </w:t>
+      </w:r>
+      <w:r>
+        <w:t xml:space="preserve">trapezium</w:t>
+      </w:r>
+      <w:r>
+        <w:t xml:space="preserve"> </w:t>
+      </w:r>
+      <w:r>
+        <w:rPr>
+          <w:strike/>
+        </w:rPr>
+        <w:t xml:space="preserve">approach,</w:t>
+      </w:r>
+      <w:r>
+        <w:t xml:space="preserve"> </w:t>
+      </w:r>
+      <w:r>
+        <w:rPr>
+          <w:b/>
+          <w:bCs/>
+          <w:u w:val="single"/>
+        </w:rPr>
+        <w:t xml:space="preserve">rule,</w:t>
+      </w:r>
+      <w:r>
+        <w:t xml:space="preserve"> </w:t>
+      </w:r>
+      <w:r>
+        <w:t xml:space="preserve">recovering lost inequality.</w:t>
       </w:r>
     </w:p>
     <w:bookmarkEnd w:id="15"/>
@@ -4420,7 +4849,22 @@
         <w:t xml:space="preserve"> </w:t>
       </w:r>
       <w:r>
-        <w:t xml:space="preserve">Sections 6.2 and 6.3 provide us with the clearest finding</w:t>
+        <w:t xml:space="preserve">Sections 6.2 and 6.3 provide</w:t>
+      </w:r>
+      <w:r>
+        <w:t xml:space="preserve"> </w:t>
+      </w:r>
+      <w:r>
+        <w:rPr>
+          <w:strike/>
+        </w:rPr>
+        <w:t xml:space="preserve">us with</w:t>
+      </w:r>
+      <w:r>
+        <w:t xml:space="preserve"> </w:t>
+      </w:r>
+      <w:r>
+        <w:t xml:space="preserve">the clearest finding</w:t>
       </w:r>
       <w:r>
         <w:t xml:space="preserve"> </w:t>
@@ -4866,24 +5310,166 @@
         <w:rPr>
           <w:strike/>
         </w:rPr>
-        <w:t xml:space="preserve">1</w:t>
-      </w:r>
-      <w:r>
-        <w:t xml:space="preserve"> </w:t>
-      </w:r>
-      <w:r>
-        <w:rPr>
-          <w:b/>
-          <w:bCs/>
-          <w:u w:val="single"/>
-        </w:rPr>
-        <w:t xml:space="preserve">1,</w:t>
-      </w:r>
-      <w:r>
-        <w:t xml:space="preserve"> </w:t>
-      </w:r>
-      <w:r>
-        <w:t xml:space="preserve">where we see</w:t>
+        <w:t xml:space="preserve">1 where we see</w:t>
+      </w:r>
+      <w:r>
+        <w:t xml:space="preserve"> </w:t>
+      </w:r>
+      <w:r>
+        <w:rPr>
+          <w:b/>
+          <w:bCs/>
+          <w:u w:val="single"/>
+        </w:rPr>
+        <w:t xml:space="preserve">1, which gives a</w:t>
+      </w:r>
+      <w:r>
+        <w:t xml:space="preserve"> </w:t>
+      </w:r>
+      <w:r>
+        <w:t xml:space="preserve">Gini</w:t>
+      </w:r>
+      <w:r>
+        <w:t xml:space="preserve"> </w:t>
+      </w:r>
+      <w:r>
+        <w:rPr>
+          <w:strike/>
+        </w:rPr>
+        <w:t xml:space="preserve">Estimate</w:t>
+      </w:r>
+      <w:r>
+        <w:t xml:space="preserve"> </w:t>
+      </w:r>
+      <w:r>
+        <w:rPr>
+          <w:b/>
+          <w:bCs/>
+          <w:u w:val="single"/>
+        </w:rPr>
+        <w:t xml:space="preserve">estimate</w:t>
+      </w:r>
+      <w:r>
+        <w:t xml:space="preserve"> </w:t>
+      </w:r>
+      <w:r>
+        <w:t xml:space="preserve">identical to</w:t>
+      </w:r>
+      <w:r>
+        <w:t xml:space="preserve"> </w:t>
+      </w:r>
+      <w:r>
+        <w:rPr>
+          <w:strike/>
+        </w:rPr>
+        <w:t xml:space="preserve">normal Quadratics.</w:t>
+      </w:r>
+      <w:r>
+        <w:t xml:space="preserve"> </w:t>
+      </w:r>
+      <w:r>
+        <w:t xml:space="preserve">[**that of the ordinary quadratic.</w:t>
+      </w:r>
+    </w:p>
+    <w:p>
+      <w:pPr>
+        <w:pStyle w:val="BodyText"/>
+      </w:pPr>
+      <w:r>
+        <w:t xml:space="preserve">To see why, write t = x − 0.5. Model 1 can be split into the best-fitting ordinary quadratic plus a q(t), where q(t) = t³ − 0.178t. The number 0.178 is chosen so that ∑tₖq(tₖ) = ∑tₖ⁴ − 0.178∑tₖ² = 0.1958 − 0.178 × 1.1 = 0, and because the tₖ are symmetric about 0, ∑q(tₖ) and ∑tₖ²q(tₖ) are also zero. So, exactly as in Section 6.3, the cubic part separates from the quadratic part in the least-squares sums and does not change it. Since q is odd, ∫₀¹q dx = ∫_−0.5^0.5(t³ − 0.178t) dt = 0, so the cubic part adds no area.**]{.underline} Due to the surprising elegance behind the result,</w:t>
+      </w:r>
+      <w:r>
+        <w:t xml:space="preserve"> </w:t>
+      </w:r>
+      <w:r>
+        <w:rPr>
+          <w:strike/>
+        </w:rPr>
+        <w:t xml:space="preserve">validation</w:t>
+      </w:r>
+      <w:r>
+        <w:t xml:space="preserve"> </w:t>
+      </w:r>
+      <w:r>
+        <w:rPr>
+          <w:b/>
+          <w:bCs/>
+          <w:u w:val="single"/>
+        </w:rPr>
+        <w:t xml:space="preserve">I validated it</w:t>
+      </w:r>
+      <w:r>
+        <w:t xml:space="preserve"> </w:t>
+      </w:r>
+      <w:r>
+        <w:t xml:space="preserve">with</w:t>
+      </w:r>
+      <w:r>
+        <w:t xml:space="preserve"> </w:t>
+      </w:r>
+      <w:r>
+        <w:rPr>
+          <w:b/>
+          <w:bCs/>
+          <w:u w:val="single"/>
+        </w:rPr>
+        <w:t xml:space="preserve">the</w:t>
+      </w:r>
+      <w:r>
+        <w:t xml:space="preserve"> </w:t>
+      </w:r>
+      <w:r>
+        <w:t xml:space="preserve">2022 data</w:t>
+      </w:r>
+      <w:r>
+        <w:t xml:space="preserve"> </w:t>
+      </w:r>
+      <w:r>
+        <w:rPr>
+          <w:strike/>
+        </w:rPr>
+        <w:t xml:space="preserve">sample</w:t>
+      </w:r>
+      <w:r>
+        <w:t xml:space="preserve"> </w:t>
+      </w:r>
+      <w:r>
+        <w:t xml:space="preserve">(Table</w:t>
+      </w:r>
+      <w:r>
+        <w:t xml:space="preserve"> </w:t>
+      </w:r>
+      <w:r>
+        <w:rPr>
+          <w:strike/>
+        </w:rPr>
+        <w:t xml:space="preserve">6) takes place.¶</w:t>
+      </w:r>
+      <w:r>
+        <w:t xml:space="preserve"> </w:t>
+      </w:r>
+      <w:r>
+        <w:rPr>
+          <w:b/>
+          <w:bCs/>
+          <w:u w:val="single"/>
+        </w:rPr>
+        <w:t xml:space="preserve">6).¶</w:t>
+      </w:r>
+      <w:r>
+        <w:t xml:space="preserve"> </w:t>
+      </w:r>
+      <w:r>
+        <w:t xml:space="preserve">As demonstrated, every cubic specification provides</w:t>
+      </w:r>
+      <w:r>
+        <w:t xml:space="preserve"> </w:t>
+      </w:r>
+      <w:r>
+        <w:rPr>
+          <w:strike/>
+        </w:rPr>
+        <w:t xml:space="preserve">an estimated</w:t>
       </w:r>
       <w:r>
         <w:t xml:space="preserve"> </w:t>
@@ -4909,70 +5495,288 @@
         <w:rPr>
           <w:strike/>
         </w:rPr>
-        <w:t xml:space="preserve">Estimate</w:t>
-      </w:r>
-      <w:r>
-        <w:t xml:space="preserve"> </w:t>
-      </w:r>
-      <w:r>
-        <w:rPr>
-          <w:b/>
-          <w:bCs/>
-          <w:u w:val="single"/>
-        </w:rPr>
-        <w:t xml:space="preserve">estimate</w:t>
-      </w:r>
-      <w:r>
-        <w:t xml:space="preserve"> </w:t>
-      </w:r>
-      <w:r>
-        <w:t xml:space="preserve">identical to</w:t>
-      </w:r>
-      <w:r>
-        <w:t xml:space="preserve"> </w:t>
-      </w:r>
-      <w:r>
-        <w:rPr>
-          <w:strike/>
-        </w:rPr>
-        <w:t xml:space="preserve">normal Quadratics.</w:t>
-      </w:r>
-      <w:r>
-        <w:t xml:space="preserve"> </w:t>
-      </w:r>
-      <w:r>
-        <w:rPr>
-          <w:b/>
-          <w:bCs/>
-          <w:u w:val="single"/>
-        </w:rPr>
-        <w:t xml:space="preserve">that of the ordinary quadratic.</w:t>
-      </w:r>
-      <w:r>
-        <w:t xml:space="preserve"> </w:t>
-      </w:r>
-      <w:r>
-        <w:t xml:space="preserve">Due to the surprising elegance behind the result,</w:t>
-      </w:r>
-      <w:r>
-        <w:t xml:space="preserve"> </w:t>
-      </w:r>
-      <w:r>
-        <w:rPr>
-          <w:strike/>
-        </w:rPr>
-        <w:t xml:space="preserve">validation</w:t>
-      </w:r>
-      <w:r>
-        <w:t xml:space="preserve"> </w:t>
-      </w:r>
-      <w:r>
-        <w:rPr>
-          <w:b/>
-          <w:bCs/>
-          <w:u w:val="single"/>
-        </w:rPr>
-        <w:t xml:space="preserve">I validated it</w:t>
+        <w:t xml:space="preserve">value equivalent</w:t>
+      </w:r>
+      <w:r>
+        <w:t xml:space="preserve"> </w:t>
+      </w:r>
+      <w:r>
+        <w:rPr>
+          <w:b/>
+          <w:bCs/>
+          <w:u w:val="single"/>
+        </w:rPr>
+        <w:t xml:space="preserve">estimate equal</w:t>
+      </w:r>
+      <w:r>
+        <w:t xml:space="preserve"> </w:t>
+      </w:r>
+      <w:r>
+        <w:t xml:space="preserve">to its quadratic counterpart</w:t>
+      </w:r>
+      <w:r>
+        <w:t xml:space="preserve"> </w:t>
+      </w:r>
+      <w:r>
+        <w:rPr>
+          <w:strike/>
+        </w:rPr>
+        <w:t xml:space="preserve">within</w:t>
+      </w:r>
+      <w:r>
+        <w:t xml:space="preserve"> </w:t>
+      </w:r>
+      <w:r>
+        <w:rPr>
+          <w:b/>
+          <w:bCs/>
+          <w:u w:val="single"/>
+        </w:rPr>
+        <w:t xml:space="preserve">to at least</w:t>
+      </w:r>
+      <w:r>
+        <w:t xml:space="preserve"> </w:t>
+      </w:r>
+      <w:r>
+        <w:t xml:space="preserve">14 decimal</w:t>
+      </w:r>
+      <w:r>
+        <w:t xml:space="preserve"> </w:t>
+      </w:r>
+      <w:r>
+        <w:rPr>
+          <w:strike/>
+        </w:rPr>
+        <w:t xml:space="preserve">places after rounding off.</w:t>
+      </w:r>
+      <w:r>
+        <w:t xml:space="preserve"> </w:t>
+      </w:r>
+      <w:r>
+        <w:rPr>
+          <w:b/>
+          <w:bCs/>
+          <w:u w:val="single"/>
+        </w:rPr>
+        <w:t xml:space="preserve">places.</w:t>
+      </w:r>
+      <w:r>
+        <w:t xml:space="preserve"> </w:t>
+      </w:r>
+      <w:r>
+        <w:t xml:space="preserve">This phenomenon is especially obvious for South Africa: the inclusion of the</w:t>
+      </w:r>
+      <w:r>
+        <w:t xml:space="preserve"> </w:t>
+      </w:r>
+      <w:r>
+        <w:rPr>
+          <w:strike/>
+        </w:rPr>
+        <w:t xml:space="preserve">Cubic</w:t>
+      </w:r>
+      <w:r>
+        <w:t xml:space="preserve"> </w:t>
+      </w:r>
+      <w:r>
+        <w:rPr>
+          <w:b/>
+          <w:bCs/>
+          <w:u w:val="single"/>
+        </w:rPr>
+        <w:t xml:space="preserve">cubic</w:t>
+      </w:r>
+      <w:r>
+        <w:t xml:space="preserve"> </w:t>
+      </w:r>
+      <w:r>
+        <w:t xml:space="preserve">component improves R² from 0.9050 to 0.9823 and transforms</w:t>
+      </w:r>
+      <w:r>
+        <w:t xml:space="preserve"> </w:t>
+      </w:r>
+      <w:r>
+        <w:rPr>
+          <w:strike/>
+        </w:rPr>
+        <w:t xml:space="preserve">the</w:t>
+      </w:r>
+      <w:r>
+        <w:t xml:space="preserve"> </w:t>
+      </w:r>
+      <w:r>
+        <w:rPr>
+          <w:b/>
+          <w:bCs/>
+          <w:u w:val="single"/>
+        </w:rPr>
+        <w:t xml:space="preserve">a graph that goes</w:t>
+      </w:r>
+      <w:r>
+        <w:t xml:space="preserve"> </w:t>
+      </w:r>
+      <w:r>
+        <w:t xml:space="preserve">negative</w:t>
+      </w:r>
+      <w:r>
+        <w:t xml:space="preserve"> </w:t>
+      </w:r>
+      <w:r>
+        <w:rPr>
+          <w:strike/>
+        </w:rPr>
+        <w:t xml:space="preserve">function graph</w:t>
+      </w:r>
+      <w:r>
+        <w:t xml:space="preserve"> </w:t>
+      </w:r>
+      <w:r>
+        <w:t xml:space="preserve">into a</w:t>
+      </w:r>
+      <w:r>
+        <w:t xml:space="preserve"> </w:t>
+      </w:r>
+      <w:r>
+        <w:rPr>
+          <w:strike/>
+        </w:rPr>
+        <w:t xml:space="preserve">nonnegative.</w:t>
+      </w:r>
+      <w:r>
+        <w:t xml:space="preserve"> </w:t>
+      </w:r>
+      <w:r>
+        <w:rPr>
+          <w:b/>
+          <w:bCs/>
+          <w:u w:val="single"/>
+        </w:rPr>
+        <w:t xml:space="preserve">non-negative one.</w:t>
+      </w:r>
+      <w:r>
+        <w:t xml:space="preserve"> </w:t>
+      </w:r>
+      <w:r>
+        <w:t xml:space="preserve">Despite all of this, there is absolutely no difference in terms of the</w:t>
+      </w:r>
+      <w:r>
+        <w:t xml:space="preserve"> </w:t>
+      </w:r>
+      <w:r>
+        <w:rPr>
+          <w:b/>
+          <w:bCs/>
+          <w:u w:val="single"/>
+        </w:rPr>
+        <w:t xml:space="preserve">estimated</w:t>
+      </w:r>
+      <w:r>
+        <w:t xml:space="preserve"> </w:t>
+      </w:r>
+      <w:r>
+        <w:t xml:space="preserve">Gini coefficient</w:t>
+      </w:r>
+      <w:r>
+        <w:t xml:space="preserve"> </w:t>
+      </w:r>
+      <w:r>
+        <w:rPr>
+          <w:strike/>
+        </w:rPr>
+        <w:t xml:space="preserve">estimated value</w:t>
+      </w:r>
+      <w:r>
+        <w:t xml:space="preserve"> </w:t>
+      </w:r>
+      <w:r>
+        <w:t xml:space="preserve">compared to the quadratic</w:t>
+      </w:r>
+      <w:r>
+        <w:t xml:space="preserve"> </w:t>
+      </w:r>
+      <w:r>
+        <w:rPr>
+          <w:strike/>
+        </w:rPr>
+        <w:t xml:space="preserve">counterparts. On</w:t>
+      </w:r>
+      <w:r>
+        <w:t xml:space="preserve"> </w:t>
+      </w:r>
+      <w:r>
+        <w:rPr>
+          <w:b/>
+          <w:bCs/>
+          <w:u w:val="single"/>
+        </w:rPr>
+        <w:t xml:space="preserve">counterpart. For the</w:t>
+      </w:r>
+      <w:r>
+        <w:t xml:space="preserve"> </w:t>
+      </w:r>
+      <w:r>
+        <w:t xml:space="preserve">Norwegian</w:t>
+      </w:r>
+      <w:r>
+        <w:t xml:space="preserve"> </w:t>
+      </w:r>
+      <w:r>
+        <w:rPr>
+          <w:strike/>
+        </w:rPr>
+        <w:t xml:space="preserve">distribution set,</w:t>
+      </w:r>
+      <w:r>
+        <w:t xml:space="preserve"> </w:t>
+      </w:r>
+      <w:r>
+        <w:rPr>
+          <w:b/>
+          <w:bCs/>
+          <w:u w:val="single"/>
+        </w:rPr>
+        <w:t xml:space="preserve">distribution, the</w:t>
+      </w:r>
+      <w:r>
+        <w:t xml:space="preserve"> </w:t>
+      </w:r>
+      <w:r>
+        <w:t xml:space="preserve">constrained quadratic is actually the only</w:t>
+      </w:r>
+      <w:r>
+        <w:t xml:space="preserve"> </w:t>
+      </w:r>
+      <w:r>
+        <w:rPr>
+          <w:strike/>
+        </w:rPr>
+        <w:t xml:space="preserve">acceptable</w:t>
+      </w:r>
+      <w:r>
+        <w:t xml:space="preserve"> </w:t>
+      </w:r>
+      <w:r>
+        <w:t xml:space="preserve">model among all four that</w:t>
+      </w:r>
+      <w:r>
+        <w:t xml:space="preserve"> </w:t>
+      </w:r>
+      <w:r>
+        <w:rPr>
+          <w:strike/>
+        </w:rPr>
+        <w:t xml:space="preserve">satisfy criteria,</w:t>
+      </w:r>
+      <w:r>
+        <w:t xml:space="preserve"> </w:t>
+      </w:r>
+      <w:r>
+        <w:rPr>
+          <w:b/>
+          <w:bCs/>
+          <w:u w:val="single"/>
+        </w:rPr>
+        <w:t xml:space="preserve">satisfies every condition,</w:t>
       </w:r>
       <w:r>
         <w:t xml:space="preserve"> </w:t>
@@ -4989,360 +5793,6 @@
           <w:bCs/>
           <w:u w:val="single"/>
         </w:rPr>
-        <w:t xml:space="preserve">the</w:t>
-      </w:r>
-      <w:r>
-        <w:t xml:space="preserve"> </w:t>
-      </w:r>
-      <w:r>
-        <w:t xml:space="preserve">2022 data</w:t>
-      </w:r>
-      <w:r>
-        <w:t xml:space="preserve"> </w:t>
-      </w:r>
-      <w:r>
-        <w:rPr>
-          <w:strike/>
-        </w:rPr>
-        <w:t xml:space="preserve">sample</w:t>
-      </w:r>
-      <w:r>
-        <w:t xml:space="preserve"> </w:t>
-      </w:r>
-      <w:r>
-        <w:t xml:space="preserve">(Table</w:t>
-      </w:r>
-      <w:r>
-        <w:t xml:space="preserve"> </w:t>
-      </w:r>
-      <w:r>
-        <w:rPr>
-          <w:strike/>
-        </w:rPr>
-        <w:t xml:space="preserve">6) takes place.¶</w:t>
-      </w:r>
-      <w:r>
-        <w:t xml:space="preserve"> </w:t>
-      </w:r>
-      <w:r>
-        <w:rPr>
-          <w:b/>
-          <w:bCs/>
-          <w:u w:val="single"/>
-        </w:rPr>
-        <w:t xml:space="preserve">6).¶</w:t>
-      </w:r>
-      <w:r>
-        <w:t xml:space="preserve"> </w:t>
-      </w:r>
-      <w:r>
-        <w:t xml:space="preserve">As demonstrated, every cubic specification provides an estimated Gini value</w:t>
-      </w:r>
-      <w:r>
-        <w:t xml:space="preserve"> </w:t>
-      </w:r>
-      <w:r>
-        <w:rPr>
-          <w:strike/>
-        </w:rPr>
-        <w:t xml:space="preserve">equivalent</w:t>
-      </w:r>
-      <w:r>
-        <w:t xml:space="preserve"> </w:t>
-      </w:r>
-      <w:r>
-        <w:rPr>
-          <w:b/>
-          <w:bCs/>
-          <w:u w:val="single"/>
-        </w:rPr>
-        <w:t xml:space="preserve">equal</w:t>
-      </w:r>
-      <w:r>
-        <w:t xml:space="preserve"> </w:t>
-      </w:r>
-      <w:r>
-        <w:t xml:space="preserve">to its quadratic counterpart</w:t>
-      </w:r>
-      <w:r>
-        <w:t xml:space="preserve"> </w:t>
-      </w:r>
-      <w:r>
-        <w:rPr>
-          <w:strike/>
-        </w:rPr>
-        <w:t xml:space="preserve">within</w:t>
-      </w:r>
-      <w:r>
-        <w:t xml:space="preserve"> </w:t>
-      </w:r>
-      <w:r>
-        <w:rPr>
-          <w:b/>
-          <w:bCs/>
-          <w:u w:val="single"/>
-        </w:rPr>
-        <w:t xml:space="preserve">to at least</w:t>
-      </w:r>
-      <w:r>
-        <w:t xml:space="preserve"> </w:t>
-      </w:r>
-      <w:r>
-        <w:t xml:space="preserve">14 decimal</w:t>
-      </w:r>
-      <w:r>
-        <w:t xml:space="preserve"> </w:t>
-      </w:r>
-      <w:r>
-        <w:rPr>
-          <w:strike/>
-        </w:rPr>
-        <w:t xml:space="preserve">places after rounding off.</w:t>
-      </w:r>
-      <w:r>
-        <w:t xml:space="preserve"> </w:t>
-      </w:r>
-      <w:r>
-        <w:rPr>
-          <w:b/>
-          <w:bCs/>
-          <w:u w:val="single"/>
-        </w:rPr>
-        <w:t xml:space="preserve">places.</w:t>
-      </w:r>
-      <w:r>
-        <w:t xml:space="preserve"> </w:t>
-      </w:r>
-      <w:r>
-        <w:t xml:space="preserve">This phenomenon is especially obvious for South Africa: the inclusion of the</w:t>
-      </w:r>
-      <w:r>
-        <w:t xml:space="preserve"> </w:t>
-      </w:r>
-      <w:r>
-        <w:rPr>
-          <w:strike/>
-        </w:rPr>
-        <w:t xml:space="preserve">Cubic</w:t>
-      </w:r>
-      <w:r>
-        <w:t xml:space="preserve"> </w:t>
-      </w:r>
-      <w:r>
-        <w:rPr>
-          <w:b/>
-          <w:bCs/>
-          <w:u w:val="single"/>
-        </w:rPr>
-        <w:t xml:space="preserve">cubic</w:t>
-      </w:r>
-      <w:r>
-        <w:t xml:space="preserve"> </w:t>
-      </w:r>
-      <w:r>
-        <w:t xml:space="preserve">component improves R² from 0.9050 to 0.9823 and transforms</w:t>
-      </w:r>
-      <w:r>
-        <w:t xml:space="preserve"> </w:t>
-      </w:r>
-      <w:r>
-        <w:rPr>
-          <w:strike/>
-        </w:rPr>
-        <w:t xml:space="preserve">the</w:t>
-      </w:r>
-      <w:r>
-        <w:t xml:space="preserve"> </w:t>
-      </w:r>
-      <w:r>
-        <w:rPr>
-          <w:b/>
-          <w:bCs/>
-          <w:u w:val="single"/>
-        </w:rPr>
-        <w:t xml:space="preserve">a graph that goes</w:t>
-      </w:r>
-      <w:r>
-        <w:t xml:space="preserve"> </w:t>
-      </w:r>
-      <w:r>
-        <w:t xml:space="preserve">negative</w:t>
-      </w:r>
-      <w:r>
-        <w:t xml:space="preserve"> </w:t>
-      </w:r>
-      <w:r>
-        <w:rPr>
-          <w:strike/>
-        </w:rPr>
-        <w:t xml:space="preserve">function graph</w:t>
-      </w:r>
-      <w:r>
-        <w:t xml:space="preserve"> </w:t>
-      </w:r>
-      <w:r>
-        <w:t xml:space="preserve">into a</w:t>
-      </w:r>
-      <w:r>
-        <w:t xml:space="preserve"> </w:t>
-      </w:r>
-      <w:r>
-        <w:rPr>
-          <w:strike/>
-        </w:rPr>
-        <w:t xml:space="preserve">nonnegative.</w:t>
-      </w:r>
-      <w:r>
-        <w:t xml:space="preserve"> </w:t>
-      </w:r>
-      <w:r>
-        <w:rPr>
-          <w:b/>
-          <w:bCs/>
-          <w:u w:val="single"/>
-        </w:rPr>
-        <w:t xml:space="preserve">non-negative one.</w:t>
-      </w:r>
-      <w:r>
-        <w:t xml:space="preserve"> </w:t>
-      </w:r>
-      <w:r>
-        <w:t xml:space="preserve">Despite all of this, there is absolutely no difference in terms of the</w:t>
-      </w:r>
-      <w:r>
-        <w:t xml:space="preserve"> </w:t>
-      </w:r>
-      <w:r>
-        <w:rPr>
-          <w:b/>
-          <w:bCs/>
-          <w:u w:val="single"/>
-        </w:rPr>
-        <w:t xml:space="preserve">estimated</w:t>
-      </w:r>
-      <w:r>
-        <w:t xml:space="preserve"> </w:t>
-      </w:r>
-      <w:r>
-        <w:t xml:space="preserve">Gini coefficient</w:t>
-      </w:r>
-      <w:r>
-        <w:t xml:space="preserve"> </w:t>
-      </w:r>
-      <w:r>
-        <w:rPr>
-          <w:strike/>
-        </w:rPr>
-        <w:t xml:space="preserve">estimated value</w:t>
-      </w:r>
-      <w:r>
-        <w:t xml:space="preserve"> </w:t>
-      </w:r>
-      <w:r>
-        <w:t xml:space="preserve">compared to the quadratic</w:t>
-      </w:r>
-      <w:r>
-        <w:t xml:space="preserve"> </w:t>
-      </w:r>
-      <w:r>
-        <w:rPr>
-          <w:strike/>
-        </w:rPr>
-        <w:t xml:space="preserve">counterparts. On</w:t>
-      </w:r>
-      <w:r>
-        <w:t xml:space="preserve"> </w:t>
-      </w:r>
-      <w:r>
-        <w:rPr>
-          <w:b/>
-          <w:bCs/>
-          <w:u w:val="single"/>
-        </w:rPr>
-        <w:t xml:space="preserve">counterpart. For the</w:t>
-      </w:r>
-      <w:r>
-        <w:t xml:space="preserve"> </w:t>
-      </w:r>
-      <w:r>
-        <w:t xml:space="preserve">Norwegian</w:t>
-      </w:r>
-      <w:r>
-        <w:t xml:space="preserve"> </w:t>
-      </w:r>
-      <w:r>
-        <w:rPr>
-          <w:strike/>
-        </w:rPr>
-        <w:t xml:space="preserve">distribution set,</w:t>
-      </w:r>
-      <w:r>
-        <w:t xml:space="preserve"> </w:t>
-      </w:r>
-      <w:r>
-        <w:rPr>
-          <w:b/>
-          <w:bCs/>
-          <w:u w:val="single"/>
-        </w:rPr>
-        <w:t xml:space="preserve">distribution, the</w:t>
-      </w:r>
-      <w:r>
-        <w:t xml:space="preserve"> </w:t>
-      </w:r>
-      <w:r>
-        <w:t xml:space="preserve">constrained quadratic is actually the only</w:t>
-      </w:r>
-      <w:r>
-        <w:t xml:space="preserve"> </w:t>
-      </w:r>
-      <w:r>
-        <w:rPr>
-          <w:strike/>
-        </w:rPr>
-        <w:t xml:space="preserve">acceptable</w:t>
-      </w:r>
-      <w:r>
-        <w:t xml:space="preserve"> </w:t>
-      </w:r>
-      <w:r>
-        <w:t xml:space="preserve">model among all four that</w:t>
-      </w:r>
-      <w:r>
-        <w:t xml:space="preserve"> </w:t>
-      </w:r>
-      <w:r>
-        <w:rPr>
-          <w:strike/>
-        </w:rPr>
-        <w:t xml:space="preserve">satisfy criteria,</w:t>
-      </w:r>
-      <w:r>
-        <w:t xml:space="preserve"> </w:t>
-      </w:r>
-      <w:r>
-        <w:rPr>
-          <w:b/>
-          <w:bCs/>
-          <w:u w:val="single"/>
-        </w:rPr>
-        <w:t xml:space="preserve">satisfies every condition,</w:t>
-      </w:r>
-      <w:r>
-        <w:t xml:space="preserve"> </w:t>
-      </w:r>
-      <w:r>
-        <w:t xml:space="preserve">with</w:t>
-      </w:r>
-      <w:r>
-        <w:t xml:space="preserve"> </w:t>
-      </w:r>
-      <w:r>
-        <w:rPr>
-          <w:b/>
-          <w:bCs/>
-          <w:u w:val="single"/>
-        </w:rPr>
         <w:t xml:space="preserve">a Gini estimate</w:t>
       </w:r>
       <w:r>
@@ -5401,7 +5851,59 @@
         <w:t xml:space="preserve"> </w:t>
       </w:r>
       <w:r>
-        <w:t xml:space="preserve">Due to these findings, we need to reconsider our research</w:t>
+        <w:t xml:space="preserve">Due to these findings,</w:t>
+      </w:r>
+      <w:r>
+        <w:t xml:space="preserve"> </w:t>
+      </w:r>
+      <w:r>
+        <w:rPr>
+          <w:strike/>
+        </w:rPr>
+        <w:t xml:space="preserve">we</w:t>
+      </w:r>
+      <w:r>
+        <w:t xml:space="preserve"> </w:t>
+      </w:r>
+      <w:r>
+        <w:rPr>
+          <w:b/>
+          <w:bCs/>
+          <w:u w:val="single"/>
+        </w:rPr>
+        <w:t xml:space="preserve">I</w:t>
+      </w:r>
+      <w:r>
+        <w:t xml:space="preserve"> </w:t>
+      </w:r>
+      <w:r>
+        <w:t xml:space="preserve">need to reconsider</w:t>
+      </w:r>
+      <w:r>
+        <w:t xml:space="preserve"> </w:t>
+      </w:r>
+      <w:r>
+        <w:rPr>
+          <w:strike/>
+        </w:rPr>
+        <w:t xml:space="preserve">our</w:t>
+      </w:r>
+      <w:r>
+        <w:t xml:space="preserve"> </w:t>
+      </w:r>
+      <w:r>
+        <w:rPr>
+          <w:b/>
+          <w:bCs/>
+          <w:u w:val="single"/>
+        </w:rPr>
+        <w:t xml:space="preserve">my</w:t>
+      </w:r>
+      <w:r>
+        <w:t xml:space="preserve"> </w:t>
+      </w:r>
+      <w:r>
+        <w:t xml:space="preserve">research</w:t>
       </w:r>
       <w:r>
         <w:t xml:space="preserve"> </w:t>
@@ -6606,22 +7108,48 @@
         <w:t xml:space="preserve"> </w:t>
       </w:r>
       <w:r>
-        <w:t xml:space="preserve">total error of estimation was divided into two distinct types according to the trapezoidal</w:t>
-      </w:r>
-      <w:r>
-        <w:t xml:space="preserve"> </w:t>
-      </w:r>
-      <w:r>
-        <w:rPr>
-          <w:strike/>
-        </w:rPr>
-        <w:t xml:space="preserve">approximation. Grouping</w:t>
-      </w:r>
-      <w:r>
-        <w:t xml:space="preserve"> </w:t>
-      </w:r>
-      <w:r>
-        <w:t xml:space="preserve">[**approximation.</w:t>
+        <w:t xml:space="preserve">total error of estimation was divided into two distinct types</w:t>
+      </w:r>
+      <w:r>
+        <w:t xml:space="preserve"> </w:t>
+      </w:r>
+      <w:r>
+        <w:rPr>
+          <w:strike/>
+        </w:rPr>
+        <w:t xml:space="preserve">according to</w:t>
+      </w:r>
+      <w:r>
+        <w:t xml:space="preserve"> </w:t>
+      </w:r>
+      <w:r>
+        <w:rPr>
+          <w:b/>
+          <w:bCs/>
+          <w:u w:val="single"/>
+        </w:rPr>
+        <w:t xml:space="preserve">using</w:t>
+      </w:r>
+      <w:r>
+        <w:t xml:space="preserve"> </w:t>
+      </w:r>
+      <w:r>
+        <w:t xml:space="preserve">the</w:t>
+      </w:r>
+      <w:r>
+        <w:t xml:space="preserve"> </w:t>
+      </w:r>
+      <w:r>
+        <w:rPr>
+          <w:strike/>
+        </w:rPr>
+        <w:t xml:space="preserve">trapezoidal approximation. Grouping</w:t>
+      </w:r>
+      <w:r>
+        <w:t xml:space="preserve"> </w:t>
+      </w:r>
+      <w:r>
+        <w:t xml:space="preserve">[**trapezium estimate.</w:t>
       </w:r>
     </w:p>
     <w:p>
@@ -7389,8 +7917,16 @@
       </w:r>
       <w:r>
         <w:rPr>
-          <w:strike/>
-        </w:rPr>
+          <w:b/>
+          <w:bCs/>
+          <w:u w:val="single"/>
+        </w:rPr>
+        <w:t xml:space="preserve">Norway’s error for</w:t>
+      </w:r>
+      <w:r>
+        <w:t xml:space="preserve"> </w:t>
+      </w:r>
+      <w:r>
         <w:t xml:space="preserve">the</w:t>
       </w:r>
       <w:r>
@@ -7398,26 +7934,35 @@
       </w:r>
       <w:r>
         <w:rPr>
-          <w:b/>
-          <w:bCs/>
-          <w:u w:val="single"/>
-        </w:rPr>
-        <w:t xml:space="preserve">Norway’s</w:t>
-      </w:r>
-      <w:r>
-        <w:t xml:space="preserve"> </w:t>
-      </w:r>
-      <w:r>
-        <w:t xml:space="preserve">error</w:t>
-      </w:r>
-      <w:r>
-        <w:t xml:space="preserve"> </w:t>
-      </w:r>
-      <w:r>
-        <w:rPr>
-          <w:strike/>
-        </w:rPr>
-        <w:t xml:space="preserve">from</w:t>
+          <w:strike/>
+        </w:rPr>
+        <w:t xml:space="preserve">error from the trapezoidal approach,</w:t>
+      </w:r>
+      <w:r>
+        <w:t xml:space="preserve"> </w:t>
+      </w:r>
+      <w:r>
+        <w:rPr>
+          <w:b/>
+          <w:bCs/>
+          <w:u w:val="single"/>
+        </w:rPr>
+        <w:t xml:space="preserve">trapezium rule,</w:t>
+      </w:r>
+      <w:r>
+        <w:t xml:space="preserve"> </w:t>
+      </w:r>
+      <w:r>
+        <w:t xml:space="preserve">2.5 times</w:t>
+      </w:r>
+      <w:r>
+        <w:t xml:space="preserve"> </w:t>
+      </w:r>
+      <w:r>
+        <w:rPr>
+          <w:strike/>
+        </w:rPr>
+        <w:t xml:space="preserve">greater error with</w:t>
       </w:r>
       <w:r>
         <w:t xml:space="preserve"> </w:t>
@@ -7434,7 +7979,22 @@
         <w:t xml:space="preserve"> </w:t>
       </w:r>
       <w:r>
-        <w:t xml:space="preserve">the trapezoidal approach, 2.5 times</w:t>
+        <w:t xml:space="preserve">Model 1</w:t>
+      </w:r>
+      <w:r>
+        <w:t xml:space="preserve"> </w:t>
+      </w:r>
+      <w:r>
+        <w:rPr>
+          <w:strike/>
+        </w:rPr>
+        <w:t xml:space="preserve">fitting,</w:t>
+      </w:r>
+      <w:r>
+        <w:t xml:space="preserve"> </w:t>
+      </w:r>
+      <w:r>
+        <w:t xml:space="preserve">and 2.7 times</w:t>
       </w:r>
       <w:r>
         <w:t xml:space="preserve"> </w:t>
@@ -7460,48 +8020,85 @@
         <w:t xml:space="preserve"> </w:t>
       </w:r>
       <w:r>
-        <w:t xml:space="preserve">Model 1</w:t>
-      </w:r>
-      <w:r>
-        <w:t xml:space="preserve"> </w:t>
-      </w:r>
-      <w:r>
-        <w:rPr>
-          <w:strike/>
-        </w:rPr>
-        <w:t xml:space="preserve">fitting,</w:t>
-      </w:r>
-      <w:r>
-        <w:t xml:space="preserve"> </w:t>
-      </w:r>
-      <w:r>
-        <w:t xml:space="preserve">and 2.7 times</w:t>
-      </w:r>
-      <w:r>
-        <w:t xml:space="preserve"> </w:t>
-      </w:r>
-      <w:r>
-        <w:rPr>
-          <w:strike/>
-        </w:rPr>
-        <w:t xml:space="preserve">greater error with</w:t>
-      </w:r>
-      <w:r>
-        <w:t xml:space="preserve"> </w:t>
-      </w:r>
-      <w:r>
-        <w:rPr>
-          <w:b/>
-          <w:bCs/>
-          <w:u w:val="single"/>
-        </w:rPr>
-        <w:t xml:space="preserve">for</w:t>
-      </w:r>
-      <w:r>
-        <w:t xml:space="preserve"> </w:t>
-      </w:r>
-      <w:r>
-        <w:t xml:space="preserve">Model 2. The relative errors generated by both sets of cubic estimations are greater in South Africa (3.09% compared to 2.44% in Model 1; 5.52% vs. 4.08% in Model 2). The relative errors generated in the trapezoidal approximation remain relatively</w:t>
+        <w:t xml:space="preserve">Model 2. The relative errors generated by both sets of cubic</w:t>
+      </w:r>
+      <w:r>
+        <w:t xml:space="preserve"> </w:t>
+      </w:r>
+      <w:r>
+        <w:rPr>
+          <w:strike/>
+        </w:rPr>
+        <w:t xml:space="preserve">estimations</w:t>
+      </w:r>
+      <w:r>
+        <w:t xml:space="preserve"> </w:t>
+      </w:r>
+      <w:r>
+        <w:rPr>
+          <w:b/>
+          <w:bCs/>
+          <w:u w:val="single"/>
+        </w:rPr>
+        <w:t xml:space="preserve">estimates</w:t>
+      </w:r>
+      <w:r>
+        <w:t xml:space="preserve"> </w:t>
+      </w:r>
+      <w:r>
+        <w:t xml:space="preserve">are greater in South Africa (3.09% compared to 2.44% in Model 1; 5.52% vs. 4.08% in Model 2). The relative errors generated</w:t>
+      </w:r>
+      <w:r>
+        <w:t xml:space="preserve"> </w:t>
+      </w:r>
+      <w:r>
+        <w:rPr>
+          <w:strike/>
+        </w:rPr>
+        <w:t xml:space="preserve">in</w:t>
+      </w:r>
+      <w:r>
+        <w:t xml:space="preserve"> </w:t>
+      </w:r>
+      <w:r>
+        <w:rPr>
+          <w:b/>
+          <w:bCs/>
+          <w:u w:val="single"/>
+        </w:rPr>
+        <w:t xml:space="preserve">by</w:t>
+      </w:r>
+      <w:r>
+        <w:t xml:space="preserve"> </w:t>
+      </w:r>
+      <w:r>
+        <w:t xml:space="preserve">the</w:t>
+      </w:r>
+      <w:r>
+        <w:t xml:space="preserve"> </w:t>
+      </w:r>
+      <w:r>
+        <w:rPr>
+          <w:strike/>
+        </w:rPr>
+        <w:t xml:space="preserve">trapezoidal approximation</w:t>
+      </w:r>
+      <w:r>
+        <w:t xml:space="preserve"> </w:t>
+      </w:r>
+      <w:r>
+        <w:rPr>
+          <w:b/>
+          <w:bCs/>
+          <w:u w:val="single"/>
+        </w:rPr>
+        <w:t xml:space="preserve">trapezium rule</w:t>
+      </w:r>
+      <w:r>
+        <w:t xml:space="preserve"> </w:t>
+      </w:r>
+      <w:r>
+        <w:t xml:space="preserve">remain relatively</w:t>
       </w:r>
       <w:r>
         <w:t xml:space="preserve"> </w:t>
@@ -8123,7 +8720,33 @@
         <w:t xml:space="preserve"> </w:t>
       </w:r>
       <w:r>
-        <w:t xml:space="preserve">is a statistic taken from a sample survey, meaning that the accuracy considered within this study relates to how close our calculation gets to the published figure rather than an accurate representation of inequality in the overall population. Consumption statistics for South Africa vs</w:t>
+        <w:t xml:space="preserve">is a statistic taken from a sample survey, meaning that the accuracy considered within this study relates to how close</w:t>
+      </w:r>
+      <w:r>
+        <w:t xml:space="preserve"> </w:t>
+      </w:r>
+      <w:r>
+        <w:rPr>
+          <w:strike/>
+        </w:rPr>
+        <w:t xml:space="preserve">our</w:t>
+      </w:r>
+      <w:r>
+        <w:t xml:space="preserve"> </w:t>
+      </w:r>
+      <w:r>
+        <w:rPr>
+          <w:b/>
+          <w:bCs/>
+          <w:u w:val="single"/>
+        </w:rPr>
+        <w:t xml:space="preserve">my</w:t>
+      </w:r>
+      <w:r>
+        <w:t xml:space="preserve"> </w:t>
+      </w:r>
+      <w:r>
+        <w:t xml:space="preserve">calculation gets to the published figure rather than an accurate representation of inequality in the overall population. Consumption statistics for South Africa vs</w:t>
       </w:r>
       <w:r>
         <w:t xml:space="preserve"> </w:t>
@@ -8542,7 +9165,33 @@
         <w:t xml:space="preserve"> </w:t>
       </w:r>
       <w:r>
-        <w:t xml:space="preserve">will satisfy the four required conditions without needing further adjustment, while computing its Gini index requires little work.</w:t>
+        <w:t xml:space="preserve">will satisfy the four required conditions without needing further adjustment, while computing its Gini</w:t>
+      </w:r>
+      <w:r>
+        <w:t xml:space="preserve"> </w:t>
+      </w:r>
+      <w:r>
+        <w:rPr>
+          <w:strike/>
+        </w:rPr>
+        <w:t xml:space="preserve">index</w:t>
+      </w:r>
+      <w:r>
+        <w:t xml:space="preserve"> </w:t>
+      </w:r>
+      <w:r>
+        <w:rPr>
+          <w:b/>
+          <w:bCs/>
+          <w:u w:val="single"/>
+        </w:rPr>
+        <w:t xml:space="preserve">coefficient</w:t>
+      </w:r>
+      <w:r>
+        <w:t xml:space="preserve"> </w:t>
+      </w:r>
+      <w:r>
+        <w:t xml:space="preserve">requires little work.</w:t>
       </w:r>
     </w:p>
     <w:p>
@@ -8570,27 +9219,27 @@
         <w:t xml:space="preserve"> </w:t>
       </w:r>
       <w:r>
-        <w:t xml:space="preserve">p within L(x) may be estimated with simple log transformations. Alternatively, it would be possible to implement a spline approximation procedure where separate cubic polynomials connect each neighboring data pair and interpolate all measured values in a smooth fashion. Provided each section remains convex, the final spline estimation will lie beneath any straight line joining two subsequent observations, therefore creating a Gini score</w:t>
-      </w:r>
-      <w:r>
-        <w:t xml:space="preserve"> </w:t>
-      </w:r>
-      <w:r>
-        <w:rPr>
-          <w:strike/>
-        </w:rPr>
-        <w:t xml:space="preserve">which exceeds</w:t>
-      </w:r>
-      <w:r>
-        <w:t xml:space="preserve"> </w:t>
-      </w:r>
-      <w:r>
-        <w:rPr>
-          <w:b/>
-          <w:bCs/>
-          <w:u w:val="single"/>
-        </w:rPr>
-        <w:t xml:space="preserve">at least as large as</w:t>
+        <w:t xml:space="preserve">p within L(x) may be estimated with simple log transformations. Alternatively, it would be possible to implement a spline approximation procedure where separate cubic polynomials connect each neighboring data pair and interpolate all measured values in a smooth fashion. Provided each section remains convex, the final spline estimation will lie beneath any straight line joining two subsequent observations, therefore creating a Gini</w:t>
+      </w:r>
+      <w:r>
+        <w:t xml:space="preserve"> </w:t>
+      </w:r>
+      <w:r>
+        <w:rPr>
+          <w:strike/>
+        </w:rPr>
+        <w:t xml:space="preserve">score which exceeds</w:t>
+      </w:r>
+      <w:r>
+        <w:t xml:space="preserve"> </w:t>
+      </w:r>
+      <w:r>
+        <w:rPr>
+          <w:b/>
+          <w:bCs/>
+          <w:u w:val="single"/>
+        </w:rPr>
+        <w:t xml:space="preserve">estimate at least as large as</w:t>
       </w:r>
       <w:r>
         <w:t xml:space="preserve"> </w:t>
@@ -8735,7 +9384,33 @@
         <w:t xml:space="preserve"> </w:t>
       </w:r>
       <w:r>
-        <w:t xml:space="preserve">yield accurate estimations of the Gini</w:t>
+        <w:t xml:space="preserve">yield accurate</w:t>
+      </w:r>
+      <w:r>
+        <w:t xml:space="preserve"> </w:t>
+      </w:r>
+      <w:r>
+        <w:rPr>
+          <w:strike/>
+        </w:rPr>
+        <w:t xml:space="preserve">estimations</w:t>
+      </w:r>
+      <w:r>
+        <w:t xml:space="preserve"> </w:t>
+      </w:r>
+      <w:r>
+        <w:rPr>
+          <w:b/>
+          <w:bCs/>
+          <w:u w:val="single"/>
+        </w:rPr>
+        <w:t xml:space="preserve">estimates</w:t>
+      </w:r>
+      <w:r>
+        <w:t xml:space="preserve"> </w:t>
+      </w:r>
+      <w:r>
+        <w:t xml:space="preserve">of the Gini</w:t>
       </w:r>
       <w:r>
         <w:t xml:space="preserve"> </w:t>
@@ -9411,7 +10086,33 @@
         <w:t xml:space="preserve"> </w:t>
       </w:r>
       <w:r>
-        <w:t xml:space="preserve">Firstly, grouping data points into deciles tends to hide the true inequalities existing within each individual group, causing underestimations. Secondly, the fixed shape of</w:t>
+        <w:t xml:space="preserve">Firstly, grouping data points into deciles tends to hide the true inequalities existing within each individual group, causing</w:t>
+      </w:r>
+      <w:r>
+        <w:t xml:space="preserve"> </w:t>
+      </w:r>
+      <w:r>
+        <w:rPr>
+          <w:strike/>
+        </w:rPr>
+        <w:t xml:space="preserve">underestimations.</w:t>
+      </w:r>
+      <w:r>
+        <w:t xml:space="preserve"> </w:t>
+      </w:r>
+      <w:r>
+        <w:rPr>
+          <w:b/>
+          <w:bCs/>
+          <w:u w:val="single"/>
+        </w:rPr>
+        <w:t xml:space="preserve">underestimates.</w:t>
+      </w:r>
+      <w:r>
+        <w:t xml:space="preserve"> </w:t>
+      </w:r>
+      <w:r>
+        <w:t xml:space="preserve">Secondly, the fixed shape of</w:t>
       </w:r>
       <w:r>
         <w:t xml:space="preserve"> </w:t>

</xml_diff>

<commit_message>
Format the final IA's references in APA style and credit Claude
- Reference list starts on a new page, in alphabetical order, with a
  hanging indent, and now includes Claude (Anthropic, 2026).
- Section 8.5 cites the data and Claude in the text, and says the Python
  script was written with Claude's help and that Claude suggested parts of
  the method and drafted explanations that the student rewrote.
- Fix the corrections check so a second page break does not hide the text.

Co-Authored-By: Claude Opus 5.5 <noreply@anthropic.com>
Claude-Session: https://claude.ai/code/session_015SCYj96TGcZgc8vCSX2dH8
</commit_message>
<xml_diff>
--- a/math-ia-gini/Corrections_to_your_text.docx
+++ b/math-ia-gini/Corrections_to_your_text.docx
@@ -2,7 +2,7 @@
 <file path=word/document.xml><?xml version="1.0" encoding="utf-8"?>
 <w:document xmlns:w="http://schemas.openxmlformats.org/wordprocessingml/2006/main" xmlns:m="http://schemas.openxmlformats.org/officeDocument/2006/math" xmlns:r="http://schemas.openxmlformats.org/officeDocument/2006/relationships" xmlns:o="urn:schemas-microsoft-com:office:office" xmlns:v="urn:schemas-microsoft-com:vml" xmlns:w10="urn:schemas-microsoft-com:office:word" xmlns:a="http://schemas.openxmlformats.org/drawingml/2006/main" xmlns:pic="http://schemas.openxmlformats.org/drawingml/2006/picture" xmlns:wp="http://schemas.openxmlformats.org/drawingml/2006/wordprocessingDrawing">
   <w:body>
-    <w:bookmarkStart w:id="29" w:name="corrections-made-to-your-text"/>
+    <w:bookmarkStart w:id="30" w:name="corrections-made-to-your-text"/>
     <w:p>
       <w:pPr>
         <w:pStyle w:val="Heading1"/>
@@ -10286,7 +10286,74 @@
         <w:pStyle w:val="FirstParagraph"/>
       </w:pPr>
       <w:r>
-        <w:t xml:space="preserve">The dataset has been acquired from the World Bank’s PIP database resource online. Coefficients, summations, errors, and integral evaluations were all performed through a custom built Python script, additionally utilized to produce all graphical representations. The regression coefficients for Model 1</w:t>
+        <w:t xml:space="preserve">The dataset has been acquired from the World Bank’s PIP database resource</w:t>
+      </w:r>
+      <w:r>
+        <w:t xml:space="preserve"> </w:t>
+      </w:r>
+      <w:r>
+        <w:rPr>
+          <w:strike/>
+        </w:rPr>
+        <w:t xml:space="preserve">online.</w:t>
+      </w:r>
+      <w:r>
+        <w:t xml:space="preserve"> </w:t>
+      </w:r>
+      <w:r>
+        <w:rPr>
+          <w:b/>
+          <w:bCs/>
+          <w:u w:val="single"/>
+        </w:rPr>
+        <w:t xml:space="preserve">online (World Bank, 2026).</w:t>
+      </w:r>
+      <w:r>
+        <w:t xml:space="preserve"> </w:t>
+      </w:r>
+      <w:r>
+        <w:t xml:space="preserve">Coefficients, summations, errors, and integral evaluations were all performed through a</w:t>
+      </w:r>
+      <w:r>
+        <w:t xml:space="preserve"> </w:t>
+      </w:r>
+      <w:r>
+        <w:rPr>
+          <w:strike/>
+        </w:rPr>
+        <w:t xml:space="preserve">custom built</w:t>
+      </w:r>
+      <w:r>
+        <w:t xml:space="preserve"> </w:t>
+      </w:r>
+      <w:r>
+        <w:t xml:space="preserve">Python</w:t>
+      </w:r>
+      <w:r>
+        <w:t xml:space="preserve"> </w:t>
+      </w:r>
+      <w:r>
+        <w:rPr>
+          <w:strike/>
+        </w:rPr>
+        <w:t xml:space="preserve">script,</w:t>
+      </w:r>
+      <w:r>
+        <w:t xml:space="preserve"> </w:t>
+      </w:r>
+      <w:r>
+        <w:rPr>
+          <w:b/>
+          <w:bCs/>
+          <w:u w:val="single"/>
+        </w:rPr>
+        <w:t xml:space="preserve">script written with the help of Claude (Anthropic, 2026),</w:t>
+      </w:r>
+      <w:r>
+        <w:t xml:space="preserve"> </w:t>
+      </w:r>
+      <w:r>
+        <w:t xml:space="preserve">additionally utilized to produce all graphical representations. The regression coefficients for Model 1</w:t>
       </w:r>
       <w:r>
         <w:t xml:space="preserve"> </w:t>
@@ -10451,24 +10518,24 @@
         <w:rPr>
           <w:strike/>
         </w:rPr>
-        <w:t xml:space="preserve">regressional equation.</w:t>
-      </w:r>
-      <w:r>
-        <w:t xml:space="preserve"> </w:t>
-      </w:r>
-      <w:r>
-        <w:rPr>
-          <w:b/>
-          <w:bCs/>
-          <w:u w:val="single"/>
-        </w:rPr>
-        <w:t xml:space="preserve">regression.</w:t>
-      </w:r>
-      <w:r>
-        <w:t xml:space="preserve"> </w:t>
-      </w:r>
-      <w:r>
-        <w:t xml:space="preserve">An artificial intelligence</w:t>
+        <w:t xml:space="preserve">regressional equation. An</w:t>
+      </w:r>
+      <w:r>
+        <w:t xml:space="preserve"> </w:t>
+      </w:r>
+      <w:r>
+        <w:rPr>
+          <w:b/>
+          <w:bCs/>
+          <w:u w:val="single"/>
+        </w:rPr>
+        <w:t xml:space="preserve">regression. Claude, an</w:t>
+      </w:r>
+      <w:r>
+        <w:t xml:space="preserve"> </w:t>
+      </w:r>
+      <w:r>
+        <w:t xml:space="preserve">artificial intelligence</w:t>
       </w:r>
       <w:r>
         <w:t xml:space="preserve"> </w:t>
@@ -10483,7 +10550,39 @@
         <w:t xml:space="preserve"> </w:t>
       </w:r>
       <w:r>
-        <w:t xml:space="preserve">assistant, Claude (Anthropic), was employed throughout the completion process in tasks such as World Bank</w:t>
+        <w:t xml:space="preserve">assistant,</w:t>
+      </w:r>
+      <w:r>
+        <w:t xml:space="preserve"> </w:t>
+      </w:r>
+      <w:r>
+        <w:rPr>
+          <w:strike/>
+        </w:rPr>
+        <w:t xml:space="preserve">Claude (Anthropic),</w:t>
+      </w:r>
+      <w:r>
+        <w:t xml:space="preserve"> </w:t>
+      </w:r>
+      <w:r>
+        <w:t xml:space="preserve">was</w:t>
+      </w:r>
+      <w:r>
+        <w:t xml:space="preserve"> </w:t>
+      </w:r>
+      <w:r>
+        <w:rPr>
+          <w:b/>
+          <w:bCs/>
+          <w:u w:val="single"/>
+        </w:rPr>
+        <w:t xml:space="preserve">also</w:t>
+      </w:r>
+      <w:r>
+        <w:t xml:space="preserve"> </w:t>
+      </w:r>
+      <w:r>
+        <w:t xml:space="preserve">employed throughout the completion process in tasks such as World Bank</w:t>
       </w:r>
       <w:r>
         <w:t xml:space="preserve"> </w:t>
@@ -10503,7 +10602,7 @@
           <w:bCs/>
           <w:u w:val="single"/>
         </w:rPr>
-        <w:t xml:space="preserve">database cross-referencing, code writing, document typesetting</w:t>
+        <w:t xml:space="preserve">database cross-referencing, code writing, suggesting parts of the mathematical method, document typesetting</w:t>
       </w:r>
       <w:r>
         <w:t xml:space="preserve"> </w:t>
@@ -10529,11 +10628,37 @@
           <w:bCs/>
           <w:u w:val="single"/>
         </w:rPr>
-        <w:t xml:space="preserve">written explanation.</w:t>
+        <w:t xml:space="preserve">drafting written explanations, which I then rewrote in my own words.</w:t>
       </w:r>
     </w:p>
     <w:bookmarkEnd w:id="28"/>
+    <w:bookmarkStart w:id="29" w:name="in-references"/>
+    <w:p>
+      <w:pPr>
+        <w:pStyle w:val="Heading3"/>
+      </w:pPr>
+      <w:r>
+        <w:t xml:space="preserve">In References</w:t>
+      </w:r>
+    </w:p>
+    <w:p>
+      <w:pPr>
+        <w:pStyle w:val="FirstParagraph"/>
+      </w:pPr>
+      <w:r>
+        <w:t xml:space="preserve"> </w:t>
+      </w:r>
+      <w:r>
+        <w:rPr>
+          <w:b/>
+          <w:bCs/>
+          <w:u w:val="single"/>
+        </w:rPr>
+        <w:t xml:space="preserve">Anthropic. (2026). Claude [Large language model]. https://claude.ai/</w:t>
+      </w:r>
+    </w:p>
     <w:bookmarkEnd w:id="29"/>
+    <w:bookmarkEnd w:id="30"/>
     <w:sectPr>
       <w:footerReference r:id="rIdFooter1" w:type="default"/>
       <w:titlePg/>
@@ -10860,7 +10985,10 @@
     <w:basedOn w:val="Normal"/>
     <w:next w:val="Bibliography"/>
     <w:qFormat/>
-    <w:pPr/>
+    <w:pPr>
+      <w:spacing w:after="120" w:before="0"/>
+      <w:ind w:hanging="720" w:left="720"/>
+    </w:pPr>
     <w:rPr/>
   </w:style>
   <w:style w:styleId="Heading1" w:type="paragraph">

</xml_diff>